<commit_message>
feat(documentation): enhance vision endpoint descriptions for image analysis and video tracking
</commit_message>
<xml_diff>
--- a/docs_output/Open-Notebook_Documentation.docx
+++ b/docs_output/Open-Notebook_Documentation.docx
@@ -1431,6 +1431,38 @@
           </w:p>
         </w:tc>
       </w:tr>
+      <w:tr>
+        <w:tc>
+          <w:tcPr>
+            <w:tcW w:type="dxa" w:w="2880"/>
+          </w:tcPr>
+          <w:p>
+            <w:r>
+              <w:t>vision.py</w:t>
+            </w:r>
+          </w:p>
+        </w:tc>
+        <w:tc>
+          <w:tcPr>
+            <w:tcW w:type="dxa" w:w="2880"/>
+          </w:tcPr>
+          <w:p>
+            <w:r>
+              <w:t>POST /vision/image-analysis, /vision/video-tracking</w:t>
+            </w:r>
+          </w:p>
+        </w:tc>
+        <w:tc>
+          <w:tcPr>
+            <w:tcW w:type="dxa" w:w="2880"/>
+          </w:tcPr>
+          <w:p>
+            <w:r>
+              <w:t>Image analysis and video object tracking. Form field 'engine' selects 'sam3' (open-vocabulary; query/target required) or 'rfdetr' (closed-vocabulary COCO; query/target optional). Forwards uploads to NOVA-Researcher.</w:t>
+            </w:r>
+          </w:p>
+        </w:tc>
+      </w:tr>
     </w:tbl>
     <w:p/>
     <w:p>
@@ -2488,7 +2520,7 @@
         <w:pStyle w:val="ListBullet"/>
       </w:pPr>
       <w:r>
-        <w:t>/vision - image analysis.</w:t>
+        <w:t>/vision - image analysis and video tracking, with two engines: SAM 3 (open-vocabulary, requires a text prompt) and RF-DETR (closed-vocabulary COCO, prompt-free; an optional class name is used as a filter).</w:t>
       </w:r>
     </w:p>
     <w:p>

</xml_diff>